<commit_message>
Nowy harmonogram: 8 spotkań, 15 h (bez 18.12; IV, V i VII do 15:00)
Co-Authored-By: Claude Opus 5.5 <noreply@anthropic.com>
</commit_message>
<xml_diff>
--- a/en/pliki/sylabus_v2_2026-27.docx
+++ b/en/pliki/sylabus_v2_2026-27.docx
@@ -216,7 +216,7 @@
               <w:pStyle w:val="Compact"/>
             </w:pPr>
             <w:r>
-              <w:t xml:space="preserve">Fridays, Aula WPiA UMCS; 9 meetings, 15 h in total: seven of 1.5 h (12:45–14:15) and two of 2 h 15 min (6.11 and 20.11.2026, 12:45–15:00)</w:t>
+              <w:t xml:space="preserve">Fridays, Aula WPiA UMCS; 8 meetings, 15 h in total: an organisational meeting on 9.10.2026 (45 min), two of 1.5 h (23.10.2026 and 15.01.2027, 12:45–14:15) and five of 2 h 15 min (6.11, 20.11, 27.11, 4.12.2026 and 22.01.2027, 12:45–15:00)</w:t>
             </w:r>
           </w:p>
         </w:tc>
@@ -1708,7 +1708,7 @@
         <w:pStyle w:val="FirstParagraph"/>
       </w:pPr>
       <w:r>
-        <w:t xml:space="preserve">Ten topics of 1.5 h each over nine meetings. Topic 4 is split between two longer meetings: the part on work (6 November 2026, together with topic 3) and the part on education (20 November 2026, together with topic 5). Meeting dates are on the course website (map and list of districts).</w:t>
+        <w:t xml:space="preserve">Ten topics over eight meetings. Topic 4 is split between two longer meetings: the part on work (6 November 2026, together with topic 3) and the part on education (20 November 2026, together with topic 5). Topic 7 is split into a part on the AI Act and the Polish act (27 November 2026, together with topic 6) and a part on the regulatory framework and copyright (4 December 2026, together with topic 8). The last meeting (22 January 2027) covers topic 10, a course summary and preparation for the assessment. Meeting dates are on the course website (map and list of districts).</w:t>
       </w:r>
     </w:p>
     <w:p>

</xml_diff>

<commit_message>
Harmonogram: 15 godzin dydaktycznych (po 45 min), wszystkie spotkania 12:45–14:15
Co-Authored-By: Claude Opus 5.5 <noreply@anthropic.com>
</commit_message>
<xml_diff>
--- a/en/pliki/sylabus_v2_2026-27.docx
+++ b/en/pliki/sylabus_v2_2026-27.docx
@@ -216,7 +216,7 @@
               <w:pStyle w:val="Compact"/>
             </w:pPr>
             <w:r>
-              <w:t xml:space="preserve">Fridays, Aula WPiA UMCS; 8 meetings, 15 h in total: an organisational meeting on 9.10.2026 (45 min), two of 1.5 h (23.10.2026 and 15.01.2027, 12:45–14:15) and five of 2 h 15 min (6.11, 20.11, 27.11, 4.12.2026 and 22.01.2027, 12:45–15:00)</w:t>
+              <w:t xml:space="preserve">Fridays, Aula WPiA UMCS; 8 meetings, 15 teaching hours in total (45 min each): an organisational meeting on 9.10.2026 (45 min) and seven of 90 min (12:45–14:15): 23.10, 6.11, 20.11, 27.11, 4.12.2026, 15.01 and 22.01.2027</w:t>
             </w:r>
           </w:p>
         </w:tc>
@@ -1708,7 +1708,7 @@
         <w:pStyle w:val="FirstParagraph"/>
       </w:pPr>
       <w:r>
-        <w:t xml:space="preserve">Ten topics over eight meetings. Topic 4 is split between two longer meetings: the part on work (6 November 2026, together with topic 3) and the part on education (20 November 2026, together with topic 5). Topic 7 is split into a part on the AI Act and the Polish act (27 November 2026, together with topic 6) and a part on the regulatory framework and copyright (4 December 2026, together with topic 8). The last meeting (22 January 2027) covers topic 10, a course summary and preparation for the assessment. Meeting dates are on the course website (map and list of districts).</w:t>
+        <w:t xml:space="preserve">Ten topics over eight meetings. Topic 4 is split between two meetings: the part on work (6 November 2026, together with topic 3) and the part on education (20 November 2026, together with topic 5). Topic 7 is split into a part on the AI Act and the Polish act (27 November 2026, together with topic 6) and a part on the regulatory framework and copyright (4 December 2026, together with topic 8). The last meeting (22 January 2027) covers topic 10, a course summary and preparation for the assessment. Meeting dates are on the course website (map and list of districts).</w:t>
       </w:r>
     </w:p>
     <w:p>

</xml_diff>